<commit_message>
did work on the alternative controller. set up two buttons, both having a debouncer, just printing to the serial console for the moment, haven't emulated the keyboard yet. one button is a toggle for the safety, and one is a hold.
</commit_message>
<xml_diff>
--- a/InitialProposal.docx
+++ b/InitialProposal.docx
@@ -58,21 +58,7 @@
         <w:rPr>
           <w:lang w:val="en-IE"/>
         </w:rPr>
-        <w:t xml:space="preserve">The ultrasonic sensor will be pointing </w:t>
-      </w:r>
-      <w:proofErr w:type="gramStart"/>
-      <w:r>
-        <w:rPr>
-          <w:lang w:val="en-IE"/>
-        </w:rPr>
-        <w:t>horizontally</w:t>
-      </w:r>
-      <w:proofErr w:type="gramEnd"/>
-      <w:r>
-        <w:rPr>
-          <w:lang w:val="en-IE"/>
-        </w:rPr>
-        <w:t xml:space="preserve"> and the player holds up their hand to point left or right or straight to drive in that direction. </w:t>
+        <w:t xml:space="preserve">The ultrasonic sensor will be pointing horizontally and the player holds up their hand to point left or right or straight to drive in that direction. </w:t>
       </w:r>
       <w:r>
         <w:rPr>
@@ -128,21 +114,7 @@
         <w:rPr>
           <w:lang w:val="en-IE"/>
         </w:rPr>
-        <w:t xml:space="preserve">The game I intend to use this alternative game controller to </w:t>
-      </w:r>
-      <w:proofErr w:type="gramStart"/>
-      <w:r>
-        <w:rPr>
-          <w:lang w:val="en-IE"/>
-        </w:rPr>
-        <w:t>play</w:t>
-      </w:r>
-      <w:proofErr w:type="gramEnd"/>
-      <w:r>
-        <w:rPr>
-          <w:lang w:val="en-IE"/>
-        </w:rPr>
-        <w:t xml:space="preserve"> and demo is called Slow Roads. It can be played in the browser at this link: </w:t>
+        <w:t xml:space="preserve">The game I intend to use this alternative game controller to play and demo is called Slow Roads. It can be played in the browser at this link: </w:t>
       </w:r>
       <w:hyperlink r:id="rId4" w:history="1">
         <w:r>
@@ -158,6 +130,19 @@
           <w:lang w:val="en-IE"/>
         </w:rPr>
         <w:t xml:space="preserve"> </w:t>
+      </w:r>
+    </w:p>
+    <w:p>
+      <w:pPr>
+        <w:rPr>
+          <w:lang w:val="en-IE"/>
+        </w:rPr>
+      </w:pPr>
+      <w:r>
+        <w:rPr>
+          <w:lang w:val="en-IE"/>
+        </w:rPr>
+        <w:t xml:space="preserve">I came up with this idea myself and hence do not have any examples that inspired me or that I want to recreate. </w:t>
       </w:r>
     </w:p>
     <w:p>

</xml_diff>